<commit_message>
Align Project 5 README format and refresh portfolio summary.
Matches the Overview / layout / Architecture outline used by other projects, updates the parent table description, and includes the What was Implemented doc content.

Co-authored-by: Cursor <cursoragent@cursor.com>
</commit_message>
<xml_diff>
--- a/project-5-azure-static-site/docs/Project 5 - What was Implemented.docx
+++ b/project-5-azure-static-site/docs/Project 5 - What was Implemented.docx
@@ -15,7 +15,7 @@
       <w:r>
         <w:t xml:space="preserve">Live Site Implemented - </w:t>
       </w:r>
-      <w:hyperlink r:id="rId4" w:history="1">
+      <w:hyperlink r:id="rId5" w:history="1">
         <w:r>
           <w:rPr>
             <w:rStyle w:val="Hyperlink"/>
@@ -24,6 +24,264 @@
         </w:r>
       </w:hyperlink>
     </w:p>
+    <w:p>
+      <w:r>
+        <w:t>Te</w:t>
+      </w:r>
+      <w:r>
+        <w:t>rraform (</w:t>
+      </w:r>
+      <w:proofErr w:type="spellStart"/>
+      <w:r>
+        <w:t>AzureRM</w:t>
+      </w:r>
+      <w:proofErr w:type="spellEnd"/>
+      <w:r>
+        <w:t>)</w:t>
+      </w:r>
+      <w:r>
+        <w:t xml:space="preserve"> infrastructure</w:t>
+      </w:r>
+    </w:p>
+    <w:p>
+      <w:pPr>
+        <w:pStyle w:val="ListParagraph"/>
+        <w:numPr>
+          <w:ilvl w:val="0"/>
+          <w:numId w:val="1"/>
+        </w:numPr>
+      </w:pPr>
+      <w:r>
+        <w:t>Built reusable Terraform modules: modules/</w:t>
+      </w:r>
+      <w:proofErr w:type="spellStart"/>
+      <w:r>
+        <w:t>storage_site</w:t>
+      </w:r>
+      <w:proofErr w:type="spellEnd"/>
+      <w:r>
+        <w:t xml:space="preserve"> and modules/</w:t>
+      </w:r>
+      <w:proofErr w:type="spellStart"/>
+      <w:r>
+        <w:t>api</w:t>
+      </w:r>
+      <w:proofErr w:type="spellEnd"/>
+    </w:p>
+    <w:p>
+      <w:pPr>
+        <w:pStyle w:val="ListParagraph"/>
+        <w:numPr>
+          <w:ilvl w:val="0"/>
+          <w:numId w:val="1"/>
+        </w:numPr>
+      </w:pPr>
+      <w:r>
+        <w:t>Resources are composed in terraform/main.tf and parameterized by region/environment variables.</w:t>
+      </w:r>
+    </w:p>
+    <w:p>
+      <w:r>
+        <w:t>Azure Storage static website hosting</w:t>
+      </w:r>
+    </w:p>
+    <w:p>
+      <w:pPr>
+        <w:pStyle w:val="ListParagraph"/>
+        <w:numPr>
+          <w:ilvl w:val="0"/>
+          <w:numId w:val="2"/>
+        </w:numPr>
+      </w:pPr>
+      <w:r>
+        <w:t>Created an Azure Storage Account configured for static website hosting.</w:t>
+      </w:r>
+    </w:p>
+    <w:p>
+      <w:pPr>
+        <w:pStyle w:val="ListParagraph"/>
+        <w:numPr>
+          <w:ilvl w:val="0"/>
+          <w:numId w:val="2"/>
+        </w:numPr>
+      </w:pPr>
+      <w:r>
+        <w:t>Uploaded the static site files (index.html, styles.css, app.js, and config.js) into the $web container via Terraform.</w:t>
+      </w:r>
+    </w:p>
+    <w:p>
+      <w:r>
+        <w:t>Static Website/UI</w:t>
+      </w:r>
+    </w:p>
+    <w:p>
+      <w:r>
+        <w:t>Visitor counter API</w:t>
+      </w:r>
+    </w:p>
+    <w:p>
+      <w:pPr>
+        <w:pStyle w:val="ListParagraph"/>
+        <w:numPr>
+          <w:ilvl w:val="0"/>
+          <w:numId w:val="3"/>
+        </w:numPr>
+      </w:pPr>
+      <w:r>
+        <w:t>Implemented an Azure Function (Consumption / Y1) with an HTTP endpoint.</w:t>
+      </w:r>
+    </w:p>
+    <w:p>
+      <w:pPr>
+        <w:pStyle w:val="ListParagraph"/>
+        <w:numPr>
+          <w:ilvl w:val="0"/>
+          <w:numId w:val="3"/>
+        </w:numPr>
+      </w:pPr>
+      <w:r>
+        <w:t>The function increments and returns the visit counter over HTTPS.</w:t>
+      </w:r>
+    </w:p>
+    <w:p>
+      <w:r>
+        <w:t>Table Storage counter backend</w:t>
+      </w:r>
+    </w:p>
+    <w:p>
+      <w:pPr>
+        <w:pStyle w:val="ListParagraph"/>
+        <w:numPr>
+          <w:ilvl w:val="0"/>
+          <w:numId w:val="4"/>
+        </w:numPr>
+      </w:pPr>
+      <w:r>
+        <w:t>Created an Azure Table Storage table (named visits) to store the counter data.</w:t>
+      </w:r>
+    </w:p>
+    <w:p>
+      <w:r>
+        <w:t>CORS configuration</w:t>
+      </w:r>
+    </w:p>
+    <w:p>
+      <w:pPr>
+        <w:pStyle w:val="ListParagraph"/>
+        <w:numPr>
+          <w:ilvl w:val="0"/>
+          <w:numId w:val="4"/>
+        </w:numPr>
+      </w:pPr>
+      <w:r>
+        <w:t>Configured the Function CORS policy to allow calls from the Storage static website origin.</w:t>
+      </w:r>
+    </w:p>
+    <w:p>
+      <w:r>
+        <w:t>Function deployment</w:t>
+      </w:r>
+    </w:p>
+    <w:p>
+      <w:pPr>
+        <w:pStyle w:val="ListParagraph"/>
+        <w:numPr>
+          <w:ilvl w:val="0"/>
+          <w:numId w:val="4"/>
+        </w:numPr>
+      </w:pPr>
+      <w:r>
+        <w:t>Packaged the Function source into a zip (data "</w:t>
+      </w:r>
+      <w:proofErr w:type="spellStart"/>
+      <w:r>
+        <w:t>archive_file</w:t>
+      </w:r>
+      <w:proofErr w:type="spellEnd"/>
+      <w:r>
+        <w:t xml:space="preserve">") and deployed it using Terraform local-exec with </w:t>
+      </w:r>
+      <w:proofErr w:type="spellStart"/>
+      <w:r>
+        <w:t>az</w:t>
+      </w:r>
+      <w:proofErr w:type="spellEnd"/>
+      <w:r>
+        <w:t xml:space="preserve"> </w:t>
+      </w:r>
+      <w:proofErr w:type="spellStart"/>
+      <w:r>
+        <w:t>functionapp</w:t>
+      </w:r>
+      <w:proofErr w:type="spellEnd"/>
+      <w:r>
+        <w:t xml:space="preserve"> deployment source config-zip.</w:t>
+      </w:r>
+    </w:p>
+    <w:p>
+      <w:r>
+        <w:t>Config-driven API URL</w:t>
+      </w:r>
+    </w:p>
+    <w:p>
+      <w:pPr>
+        <w:pStyle w:val="ListParagraph"/>
+        <w:numPr>
+          <w:ilvl w:val="0"/>
+          <w:numId w:val="4"/>
+        </w:numPr>
+      </w:pPr>
+      <w:r>
+        <w:t>Terraform generates config.js so the frontend knows whether to call the real Function endpoint or a disabled/default path.</w:t>
+      </w:r>
+    </w:p>
+    <w:p>
+      <w:r>
+        <w:t>Azure subscription quota workaround</w:t>
+      </w:r>
+    </w:p>
+    <w:p>
+      <w:pPr>
+        <w:pStyle w:val="ListParagraph"/>
+        <w:numPr>
+          <w:ilvl w:val="0"/>
+          <w:numId w:val="4"/>
+        </w:numPr>
+      </w:pPr>
+      <w:r>
+        <w:lastRenderedPageBreak/>
+        <w:t xml:space="preserve">Added an </w:t>
+      </w:r>
+      <w:proofErr w:type="spellStart"/>
+      <w:r>
+        <w:t>enable_visitor_api</w:t>
+      </w:r>
+      <w:proofErr w:type="spellEnd"/>
+      <w:r>
+        <w:t xml:space="preserve"> flag so the static site can still deploy when the subscription has 0 VM compute quota.</w:t>
+      </w:r>
+    </w:p>
+    <w:p>
+      <w:r>
+        <w:t>Cost discipline</w:t>
+      </w:r>
+    </w:p>
+    <w:p>
+      <w:pPr>
+        <w:pStyle w:val="ListParagraph"/>
+        <w:numPr>
+          <w:ilvl w:val="0"/>
+          <w:numId w:val="4"/>
+        </w:numPr>
+      </w:pPr>
+      <w:r>
+        <w:t>Able to destroy infrastructure</w:t>
+      </w:r>
+      <w:r>
+        <w:t xml:space="preserve"> when not demoing. </w:t>
+      </w:r>
+    </w:p>
+    <w:p/>
     <w:sectPr>
       <w:pgSz w:w="12240" w:h="15840"/>
       <w:pgMar w:top="1440" w:right="1440" w:bottom="1440" w:left="1440" w:header="720" w:footer="720" w:gutter="0"/>
@@ -32,6 +290,475 @@
     </w:sectPr>
   </w:body>
 </w:document>
+</file>
+
+<file path=word/numbering.xml><?xml version="1.0" encoding="utf-8"?>
+<w:numbering xmlns:wpc="http://schemas.microsoft.com/office/word/2010/wordprocessingCanvas" xmlns:cx="http://schemas.microsoft.com/office/drawing/2014/chartex" xmlns:cx1="http://schemas.microsoft.com/office/drawing/2015/9/8/chartex" xmlns:cx2="http://schemas.microsoft.com/office/drawing/2015/10/21/chartex" xmlns:cx3="http://schemas.microsoft.com/office/drawing/2016/5/9/chartex" xmlns:cx4="http://schemas.microsoft.com/office/drawing/2016/5/10/chartex" xmlns:cx5="http://schemas.microsoft.com/office/drawing/2016/5/11/chartex" xmlns:cx6="http://schemas.microsoft.com/office/drawing/2016/5/12/chartex" xmlns:cx7="http://schemas.microsoft.com/office/drawing/2016/5/13/chartex" xmlns:cx8="http://schemas.microsoft.com/office/drawing/2016/5/14/chartex" xmlns:mc="http://schemas.openxmlformats.org/markup-compatibility/2006" xmlns:aink="http://schemas.microsoft.com/office/drawing/2016/ink" xmlns:am3d="http://schemas.microsoft.com/office/drawing/2017/model3d" xmlns:o="urn:schemas-microsoft-com:office:office" xmlns:oel="http://schemas.microsoft.com/office/2019/extlst" xmlns:r="http://schemas.openxmlformats.org/officeDocument/2006/relationships" xmlns:m="http://schemas.openxmlformats.org/officeDocument/2006/math" xmlns:v="urn:schemas-microsoft-com:vml" xmlns:wp14="http://schemas.microsoft.com/office/word/2010/wordprocessingDrawing" xmlns:wp="http://schemas.openxmlformats.org/drawingml/2006/wordprocessingDrawing" xmlns:w10="urn:schemas-microsoft-com:office:word" xmlns:w="http://schemas.openxmlformats.org/wordprocessingml/2006/main" xmlns:w14="http://schemas.microsoft.com/office/word/2010/wordml" xmlns:w15="http://schemas.microsoft.com/office/word/2012/wordml" xmlns:w16cei="http://schemas.microsoft.com/office/word/2026/wordml/cei" xmlns:w16cex="http://schemas.microsoft.com/office/word/2018/wordml/cex" xmlns:w16cid="http://schemas.microsoft.com/office/word/2016/wordml/cid" xmlns:w16="http://schemas.microsoft.com/office/word/2018/wordml" xmlns:w16du="http://schemas.microsoft.com/office/word/2023/wordml/word16du" xmlns:w16sdtdh="http://schemas.microsoft.com/office/word/2020/wordml/sdtdatahash" xmlns:w16sdtfl="http://schemas.microsoft.com/office/word/2024/wordml/sdtformatlock" xmlns:w16se="http://schemas.microsoft.com/office/word/2015/wordml/symex" xmlns:wpg="http://schemas.microsoft.com/office/word/2010/wordprocessingGroup" xmlns:wpi="http://schemas.microsoft.com/office/word/2010/wordprocessingInk" xmlns:wne="http://schemas.microsoft.com/office/word/2006/wordml" xmlns:wps="http://schemas.microsoft.com/office/word/2010/wordprocessingShape" mc:Ignorable="w14 w15 w16se w16cid w16 w16cex w16sdtdh w16sdtfl w16du wp14">
+  <w:abstractNum w:abstractNumId="0" w15:restartNumberingAfterBreak="0">
+    <w:nsid w:val="27D258BD"/>
+    <w:multiLevelType w:val="hybridMultilevel"/>
+    <w:tmpl w:val="10607546"/>
+    <w:lvl w:ilvl="0" w:tplc="04090001">
+      <w:start w:val="1"/>
+      <w:numFmt w:val="bullet"/>
+      <w:lvlText w:val=""/>
+      <w:lvlJc w:val="left"/>
+      <w:pPr>
+        <w:ind w:left="720" w:hanging="360"/>
+      </w:pPr>
+      <w:rPr>
+        <w:rFonts w:ascii="Symbol" w:hAnsi="Symbol" w:hint="default"/>
+      </w:rPr>
+    </w:lvl>
+    <w:lvl w:ilvl="1" w:tplc="04090003" w:tentative="1">
+      <w:start w:val="1"/>
+      <w:numFmt w:val="bullet"/>
+      <w:lvlText w:val="o"/>
+      <w:lvlJc w:val="left"/>
+      <w:pPr>
+        <w:ind w:left="1440" w:hanging="360"/>
+      </w:pPr>
+      <w:rPr>
+        <w:rFonts w:ascii="Courier New" w:hAnsi="Courier New" w:cs="Courier New" w:hint="default"/>
+      </w:rPr>
+    </w:lvl>
+    <w:lvl w:ilvl="2" w:tplc="04090005" w:tentative="1">
+      <w:start w:val="1"/>
+      <w:numFmt w:val="bullet"/>
+      <w:lvlText w:val=""/>
+      <w:lvlJc w:val="left"/>
+      <w:pPr>
+        <w:ind w:left="2160" w:hanging="360"/>
+      </w:pPr>
+      <w:rPr>
+        <w:rFonts w:ascii="Wingdings" w:hAnsi="Wingdings" w:hint="default"/>
+      </w:rPr>
+    </w:lvl>
+    <w:lvl w:ilvl="3" w:tplc="04090001" w:tentative="1">
+      <w:start w:val="1"/>
+      <w:numFmt w:val="bullet"/>
+      <w:lvlText w:val=""/>
+      <w:lvlJc w:val="left"/>
+      <w:pPr>
+        <w:ind w:left="2880" w:hanging="360"/>
+      </w:pPr>
+      <w:rPr>
+        <w:rFonts w:ascii="Symbol" w:hAnsi="Symbol" w:hint="default"/>
+      </w:rPr>
+    </w:lvl>
+    <w:lvl w:ilvl="4" w:tplc="04090003" w:tentative="1">
+      <w:start w:val="1"/>
+      <w:numFmt w:val="bullet"/>
+      <w:lvlText w:val="o"/>
+      <w:lvlJc w:val="left"/>
+      <w:pPr>
+        <w:ind w:left="3600" w:hanging="360"/>
+      </w:pPr>
+      <w:rPr>
+        <w:rFonts w:ascii="Courier New" w:hAnsi="Courier New" w:cs="Courier New" w:hint="default"/>
+      </w:rPr>
+    </w:lvl>
+    <w:lvl w:ilvl="5" w:tplc="04090005" w:tentative="1">
+      <w:start w:val="1"/>
+      <w:numFmt w:val="bullet"/>
+      <w:lvlText w:val=""/>
+      <w:lvlJc w:val="left"/>
+      <w:pPr>
+        <w:ind w:left="4320" w:hanging="360"/>
+      </w:pPr>
+      <w:rPr>
+        <w:rFonts w:ascii="Wingdings" w:hAnsi="Wingdings" w:hint="default"/>
+      </w:rPr>
+    </w:lvl>
+    <w:lvl w:ilvl="6" w:tplc="04090001" w:tentative="1">
+      <w:start w:val="1"/>
+      <w:numFmt w:val="bullet"/>
+      <w:lvlText w:val=""/>
+      <w:lvlJc w:val="left"/>
+      <w:pPr>
+        <w:ind w:left="5040" w:hanging="360"/>
+      </w:pPr>
+      <w:rPr>
+        <w:rFonts w:ascii="Symbol" w:hAnsi="Symbol" w:hint="default"/>
+      </w:rPr>
+    </w:lvl>
+    <w:lvl w:ilvl="7" w:tplc="04090003" w:tentative="1">
+      <w:start w:val="1"/>
+      <w:numFmt w:val="bullet"/>
+      <w:lvlText w:val="o"/>
+      <w:lvlJc w:val="left"/>
+      <w:pPr>
+        <w:ind w:left="5760" w:hanging="360"/>
+      </w:pPr>
+      <w:rPr>
+        <w:rFonts w:ascii="Courier New" w:hAnsi="Courier New" w:cs="Courier New" w:hint="default"/>
+      </w:rPr>
+    </w:lvl>
+    <w:lvl w:ilvl="8" w:tplc="04090005" w:tentative="1">
+      <w:start w:val="1"/>
+      <w:numFmt w:val="bullet"/>
+      <w:lvlText w:val=""/>
+      <w:lvlJc w:val="left"/>
+      <w:pPr>
+        <w:ind w:left="6480" w:hanging="360"/>
+      </w:pPr>
+      <w:rPr>
+        <w:rFonts w:ascii="Wingdings" w:hAnsi="Wingdings" w:hint="default"/>
+      </w:rPr>
+    </w:lvl>
+  </w:abstractNum>
+  <w:abstractNum w:abstractNumId="1" w15:restartNumberingAfterBreak="0">
+    <w:nsid w:val="2E8E3EAF"/>
+    <w:multiLevelType w:val="hybridMultilevel"/>
+    <w:tmpl w:val="1FDA7292"/>
+    <w:lvl w:ilvl="0" w:tplc="04090001">
+      <w:start w:val="1"/>
+      <w:numFmt w:val="bullet"/>
+      <w:lvlText w:val=""/>
+      <w:lvlJc w:val="left"/>
+      <w:pPr>
+        <w:ind w:left="720" w:hanging="360"/>
+      </w:pPr>
+      <w:rPr>
+        <w:rFonts w:ascii="Symbol" w:hAnsi="Symbol" w:hint="default"/>
+      </w:rPr>
+    </w:lvl>
+    <w:lvl w:ilvl="1" w:tplc="04090003" w:tentative="1">
+      <w:start w:val="1"/>
+      <w:numFmt w:val="bullet"/>
+      <w:lvlText w:val="o"/>
+      <w:lvlJc w:val="left"/>
+      <w:pPr>
+        <w:ind w:left="1440" w:hanging="360"/>
+      </w:pPr>
+      <w:rPr>
+        <w:rFonts w:ascii="Courier New" w:hAnsi="Courier New" w:cs="Courier New" w:hint="default"/>
+      </w:rPr>
+    </w:lvl>
+    <w:lvl w:ilvl="2" w:tplc="04090005" w:tentative="1">
+      <w:start w:val="1"/>
+      <w:numFmt w:val="bullet"/>
+      <w:lvlText w:val=""/>
+      <w:lvlJc w:val="left"/>
+      <w:pPr>
+        <w:ind w:left="2160" w:hanging="360"/>
+      </w:pPr>
+      <w:rPr>
+        <w:rFonts w:ascii="Wingdings" w:hAnsi="Wingdings" w:hint="default"/>
+      </w:rPr>
+    </w:lvl>
+    <w:lvl w:ilvl="3" w:tplc="04090001" w:tentative="1">
+      <w:start w:val="1"/>
+      <w:numFmt w:val="bullet"/>
+      <w:lvlText w:val=""/>
+      <w:lvlJc w:val="left"/>
+      <w:pPr>
+        <w:ind w:left="2880" w:hanging="360"/>
+      </w:pPr>
+      <w:rPr>
+        <w:rFonts w:ascii="Symbol" w:hAnsi="Symbol" w:hint="default"/>
+      </w:rPr>
+    </w:lvl>
+    <w:lvl w:ilvl="4" w:tplc="04090003" w:tentative="1">
+      <w:start w:val="1"/>
+      <w:numFmt w:val="bullet"/>
+      <w:lvlText w:val="o"/>
+      <w:lvlJc w:val="left"/>
+      <w:pPr>
+        <w:ind w:left="3600" w:hanging="360"/>
+      </w:pPr>
+      <w:rPr>
+        <w:rFonts w:ascii="Courier New" w:hAnsi="Courier New" w:cs="Courier New" w:hint="default"/>
+      </w:rPr>
+    </w:lvl>
+    <w:lvl w:ilvl="5" w:tplc="04090005" w:tentative="1">
+      <w:start w:val="1"/>
+      <w:numFmt w:val="bullet"/>
+      <w:lvlText w:val=""/>
+      <w:lvlJc w:val="left"/>
+      <w:pPr>
+        <w:ind w:left="4320" w:hanging="360"/>
+      </w:pPr>
+      <w:rPr>
+        <w:rFonts w:ascii="Wingdings" w:hAnsi="Wingdings" w:hint="default"/>
+      </w:rPr>
+    </w:lvl>
+    <w:lvl w:ilvl="6" w:tplc="04090001" w:tentative="1">
+      <w:start w:val="1"/>
+      <w:numFmt w:val="bullet"/>
+      <w:lvlText w:val=""/>
+      <w:lvlJc w:val="left"/>
+      <w:pPr>
+        <w:ind w:left="5040" w:hanging="360"/>
+      </w:pPr>
+      <w:rPr>
+        <w:rFonts w:ascii="Symbol" w:hAnsi="Symbol" w:hint="default"/>
+      </w:rPr>
+    </w:lvl>
+    <w:lvl w:ilvl="7" w:tplc="04090003" w:tentative="1">
+      <w:start w:val="1"/>
+      <w:numFmt w:val="bullet"/>
+      <w:lvlText w:val="o"/>
+      <w:lvlJc w:val="left"/>
+      <w:pPr>
+        <w:ind w:left="5760" w:hanging="360"/>
+      </w:pPr>
+      <w:rPr>
+        <w:rFonts w:ascii="Courier New" w:hAnsi="Courier New" w:cs="Courier New" w:hint="default"/>
+      </w:rPr>
+    </w:lvl>
+    <w:lvl w:ilvl="8" w:tplc="04090005" w:tentative="1">
+      <w:start w:val="1"/>
+      <w:numFmt w:val="bullet"/>
+      <w:lvlText w:val=""/>
+      <w:lvlJc w:val="left"/>
+      <w:pPr>
+        <w:ind w:left="6480" w:hanging="360"/>
+      </w:pPr>
+      <w:rPr>
+        <w:rFonts w:ascii="Wingdings" w:hAnsi="Wingdings" w:hint="default"/>
+      </w:rPr>
+    </w:lvl>
+  </w:abstractNum>
+  <w:abstractNum w:abstractNumId="2" w15:restartNumberingAfterBreak="0">
+    <w:nsid w:val="477D42EA"/>
+    <w:multiLevelType w:val="hybridMultilevel"/>
+    <w:tmpl w:val="B75279A6"/>
+    <w:lvl w:ilvl="0" w:tplc="04090001">
+      <w:start w:val="1"/>
+      <w:numFmt w:val="bullet"/>
+      <w:lvlText w:val=""/>
+      <w:lvlJc w:val="left"/>
+      <w:pPr>
+        <w:ind w:left="720" w:hanging="360"/>
+      </w:pPr>
+      <w:rPr>
+        <w:rFonts w:ascii="Symbol" w:hAnsi="Symbol" w:hint="default"/>
+      </w:rPr>
+    </w:lvl>
+    <w:lvl w:ilvl="1" w:tplc="04090003" w:tentative="1">
+      <w:start w:val="1"/>
+      <w:numFmt w:val="bullet"/>
+      <w:lvlText w:val="o"/>
+      <w:lvlJc w:val="left"/>
+      <w:pPr>
+        <w:ind w:left="1440" w:hanging="360"/>
+      </w:pPr>
+      <w:rPr>
+        <w:rFonts w:ascii="Courier New" w:hAnsi="Courier New" w:cs="Courier New" w:hint="default"/>
+      </w:rPr>
+    </w:lvl>
+    <w:lvl w:ilvl="2" w:tplc="04090005" w:tentative="1">
+      <w:start w:val="1"/>
+      <w:numFmt w:val="bullet"/>
+      <w:lvlText w:val=""/>
+      <w:lvlJc w:val="left"/>
+      <w:pPr>
+        <w:ind w:left="2160" w:hanging="360"/>
+      </w:pPr>
+      <w:rPr>
+        <w:rFonts w:ascii="Wingdings" w:hAnsi="Wingdings" w:hint="default"/>
+      </w:rPr>
+    </w:lvl>
+    <w:lvl w:ilvl="3" w:tplc="04090001" w:tentative="1">
+      <w:start w:val="1"/>
+      <w:numFmt w:val="bullet"/>
+      <w:lvlText w:val=""/>
+      <w:lvlJc w:val="left"/>
+      <w:pPr>
+        <w:ind w:left="2880" w:hanging="360"/>
+      </w:pPr>
+      <w:rPr>
+        <w:rFonts w:ascii="Symbol" w:hAnsi="Symbol" w:hint="default"/>
+      </w:rPr>
+    </w:lvl>
+    <w:lvl w:ilvl="4" w:tplc="04090003" w:tentative="1">
+      <w:start w:val="1"/>
+      <w:numFmt w:val="bullet"/>
+      <w:lvlText w:val="o"/>
+      <w:lvlJc w:val="left"/>
+      <w:pPr>
+        <w:ind w:left="3600" w:hanging="360"/>
+      </w:pPr>
+      <w:rPr>
+        <w:rFonts w:ascii="Courier New" w:hAnsi="Courier New" w:cs="Courier New" w:hint="default"/>
+      </w:rPr>
+    </w:lvl>
+    <w:lvl w:ilvl="5" w:tplc="04090005" w:tentative="1">
+      <w:start w:val="1"/>
+      <w:numFmt w:val="bullet"/>
+      <w:lvlText w:val=""/>
+      <w:lvlJc w:val="left"/>
+      <w:pPr>
+        <w:ind w:left="4320" w:hanging="360"/>
+      </w:pPr>
+      <w:rPr>
+        <w:rFonts w:ascii="Wingdings" w:hAnsi="Wingdings" w:hint="default"/>
+      </w:rPr>
+    </w:lvl>
+    <w:lvl w:ilvl="6" w:tplc="04090001" w:tentative="1">
+      <w:start w:val="1"/>
+      <w:numFmt w:val="bullet"/>
+      <w:lvlText w:val=""/>
+      <w:lvlJc w:val="left"/>
+      <w:pPr>
+        <w:ind w:left="5040" w:hanging="360"/>
+      </w:pPr>
+      <w:rPr>
+        <w:rFonts w:ascii="Symbol" w:hAnsi="Symbol" w:hint="default"/>
+      </w:rPr>
+    </w:lvl>
+    <w:lvl w:ilvl="7" w:tplc="04090003" w:tentative="1">
+      <w:start w:val="1"/>
+      <w:numFmt w:val="bullet"/>
+      <w:lvlText w:val="o"/>
+      <w:lvlJc w:val="left"/>
+      <w:pPr>
+        <w:ind w:left="5760" w:hanging="360"/>
+      </w:pPr>
+      <w:rPr>
+        <w:rFonts w:ascii="Courier New" w:hAnsi="Courier New" w:cs="Courier New" w:hint="default"/>
+      </w:rPr>
+    </w:lvl>
+    <w:lvl w:ilvl="8" w:tplc="04090005" w:tentative="1">
+      <w:start w:val="1"/>
+      <w:numFmt w:val="bullet"/>
+      <w:lvlText w:val=""/>
+      <w:lvlJc w:val="left"/>
+      <w:pPr>
+        <w:ind w:left="6480" w:hanging="360"/>
+      </w:pPr>
+      <w:rPr>
+        <w:rFonts w:ascii="Wingdings" w:hAnsi="Wingdings" w:hint="default"/>
+      </w:rPr>
+    </w:lvl>
+  </w:abstractNum>
+  <w:abstractNum w:abstractNumId="3" w15:restartNumberingAfterBreak="0">
+    <w:nsid w:val="7441217F"/>
+    <w:multiLevelType w:val="hybridMultilevel"/>
+    <w:tmpl w:val="B106E772"/>
+    <w:lvl w:ilvl="0" w:tplc="04090001">
+      <w:start w:val="1"/>
+      <w:numFmt w:val="bullet"/>
+      <w:lvlText w:val=""/>
+      <w:lvlJc w:val="left"/>
+      <w:pPr>
+        <w:ind w:left="720" w:hanging="360"/>
+      </w:pPr>
+      <w:rPr>
+        <w:rFonts w:ascii="Symbol" w:hAnsi="Symbol" w:hint="default"/>
+      </w:rPr>
+    </w:lvl>
+    <w:lvl w:ilvl="1" w:tplc="04090003" w:tentative="1">
+      <w:start w:val="1"/>
+      <w:numFmt w:val="bullet"/>
+      <w:lvlText w:val="o"/>
+      <w:lvlJc w:val="left"/>
+      <w:pPr>
+        <w:ind w:left="1440" w:hanging="360"/>
+      </w:pPr>
+      <w:rPr>
+        <w:rFonts w:ascii="Courier New" w:hAnsi="Courier New" w:cs="Courier New" w:hint="default"/>
+      </w:rPr>
+    </w:lvl>
+    <w:lvl w:ilvl="2" w:tplc="04090005" w:tentative="1">
+      <w:start w:val="1"/>
+      <w:numFmt w:val="bullet"/>
+      <w:lvlText w:val=""/>
+      <w:lvlJc w:val="left"/>
+      <w:pPr>
+        <w:ind w:left="2160" w:hanging="360"/>
+      </w:pPr>
+      <w:rPr>
+        <w:rFonts w:ascii="Wingdings" w:hAnsi="Wingdings" w:hint="default"/>
+      </w:rPr>
+    </w:lvl>
+    <w:lvl w:ilvl="3" w:tplc="04090001" w:tentative="1">
+      <w:start w:val="1"/>
+      <w:numFmt w:val="bullet"/>
+      <w:lvlText w:val=""/>
+      <w:lvlJc w:val="left"/>
+      <w:pPr>
+        <w:ind w:left="2880" w:hanging="360"/>
+      </w:pPr>
+      <w:rPr>
+        <w:rFonts w:ascii="Symbol" w:hAnsi="Symbol" w:hint="default"/>
+      </w:rPr>
+    </w:lvl>
+    <w:lvl w:ilvl="4" w:tplc="04090003" w:tentative="1">
+      <w:start w:val="1"/>
+      <w:numFmt w:val="bullet"/>
+      <w:lvlText w:val="o"/>
+      <w:lvlJc w:val="left"/>
+      <w:pPr>
+        <w:ind w:left="3600" w:hanging="360"/>
+      </w:pPr>
+      <w:rPr>
+        <w:rFonts w:ascii="Courier New" w:hAnsi="Courier New" w:cs="Courier New" w:hint="default"/>
+      </w:rPr>
+    </w:lvl>
+    <w:lvl w:ilvl="5" w:tplc="04090005" w:tentative="1">
+      <w:start w:val="1"/>
+      <w:numFmt w:val="bullet"/>
+      <w:lvlText w:val=""/>
+      <w:lvlJc w:val="left"/>
+      <w:pPr>
+        <w:ind w:left="4320" w:hanging="360"/>
+      </w:pPr>
+      <w:rPr>
+        <w:rFonts w:ascii="Wingdings" w:hAnsi="Wingdings" w:hint="default"/>
+      </w:rPr>
+    </w:lvl>
+    <w:lvl w:ilvl="6" w:tplc="04090001" w:tentative="1">
+      <w:start w:val="1"/>
+      <w:numFmt w:val="bullet"/>
+      <w:lvlText w:val=""/>
+      <w:lvlJc w:val="left"/>
+      <w:pPr>
+        <w:ind w:left="5040" w:hanging="360"/>
+      </w:pPr>
+      <w:rPr>
+        <w:rFonts w:ascii="Symbol" w:hAnsi="Symbol" w:hint="default"/>
+      </w:rPr>
+    </w:lvl>
+    <w:lvl w:ilvl="7" w:tplc="04090003" w:tentative="1">
+      <w:start w:val="1"/>
+      <w:numFmt w:val="bullet"/>
+      <w:lvlText w:val="o"/>
+      <w:lvlJc w:val="left"/>
+      <w:pPr>
+        <w:ind w:left="5760" w:hanging="360"/>
+      </w:pPr>
+      <w:rPr>
+        <w:rFonts w:ascii="Courier New" w:hAnsi="Courier New" w:cs="Courier New" w:hint="default"/>
+      </w:rPr>
+    </w:lvl>
+    <w:lvl w:ilvl="8" w:tplc="04090005" w:tentative="1">
+      <w:start w:val="1"/>
+      <w:numFmt w:val="bullet"/>
+      <w:lvlText w:val=""/>
+      <w:lvlJc w:val="left"/>
+      <w:pPr>
+        <w:ind w:left="6480" w:hanging="360"/>
+      </w:pPr>
+      <w:rPr>
+        <w:rFonts w:ascii="Wingdings" w:hAnsi="Wingdings" w:hint="default"/>
+      </w:rPr>
+    </w:lvl>
+  </w:abstractNum>
+  <w:num w:numId="1" w16cid:durableId="2061130775">
+    <w:abstractNumId w:val="0"/>
+  </w:num>
+  <w:num w:numId="2" w16cid:durableId="1361009237">
+    <w:abstractNumId w:val="2"/>
+  </w:num>
+  <w:num w:numId="3" w16cid:durableId="669020835">
+    <w:abstractNumId w:val="1"/>
+  </w:num>
+  <w:num w:numId="4" w16cid:durableId="702902011">
+    <w:abstractNumId w:val="3"/>
+  </w:num>
+</w:numbering>
 </file>
 
 <file path=word/styles.xml><?xml version="1.0" encoding="utf-8"?>
@@ -637,7 +1364,6 @@
   <w:style w:type="character" w:default="1" w:styleId="DefaultParagraphFont">
     <w:name w:val="Default Paragraph Font"/>
     <w:uiPriority w:val="1"/>
-    <w:semiHidden/>
     <w:unhideWhenUsed/>
   </w:style>
   <w:style w:type="table" w:default="1" w:styleId="TableNormal">

</xml_diff>

<commit_message>
Update Project 5 What was Implemented document.
Reflects the latest edits to the Project 5 implementation write-up.

Co-authored-by: Cursor <cursoragent@cursor.com>
</commit_message>
<xml_diff>
--- a/project-5-azure-static-site/docs/Project 5 - What was Implemented.docx
+++ b/project-5-azure-static-site/docs/Project 5 - What was Implemented.docx
@@ -4,9 +4,18 @@
   <w:body>
     <w:p>
       <w:pPr>
+        <w:pStyle w:val="Title"/>
         <w:jc w:val="center"/>
-      </w:pPr>
-      <w:r>
+        <w:rPr>
+          <w:sz w:val="30"/>
+          <w:szCs w:val="30"/>
+        </w:rPr>
+      </w:pPr>
+      <w:r>
+        <w:rPr>
+          <w:sz w:val="30"/>
+          <w:szCs w:val="30"/>
+        </w:rPr>
         <w:t>Project 5 – What was Implemented</w:t>
       </w:r>
     </w:p>
@@ -15,7 +24,7 @@
       <w:r>
         <w:t xml:space="preserve">Live Site Implemented - </w:t>
       </w:r>
-      <w:hyperlink r:id="rId5" w:history="1">
+      <w:hyperlink r:id="rId8" w:history="1">
         <w:r>
           <w:rPr>
             <w:rStyle w:val="Hyperlink"/>
@@ -24,24 +33,785 @@
         </w:r>
       </w:hyperlink>
     </w:p>
+    <w:sdt>
+      <w:sdtPr>
+        <w:id w:val="-2144416483"/>
+        <w:docPartObj>
+          <w:docPartGallery w:val="Table of Contents"/>
+          <w:docPartUnique/>
+        </w:docPartObj>
+      </w:sdtPr>
+      <w:sdtEndPr>
+        <w:rPr>
+          <w:rFonts w:asciiTheme="minorHAnsi" w:eastAsiaTheme="minorHAnsi" w:hAnsiTheme="minorHAnsi" w:cstheme="minorBidi"/>
+          <w:b/>
+          <w:bCs/>
+          <w:noProof/>
+          <w:color w:val="auto"/>
+          <w:kern w:val="2"/>
+          <w:sz w:val="24"/>
+          <w:szCs w:val="24"/>
+          <w14:ligatures w14:val="standardContextual"/>
+        </w:rPr>
+      </w:sdtEndPr>
+      <w:sdtContent>
+        <w:p>
+          <w:pPr>
+            <w:pStyle w:val="TOCHeading"/>
+          </w:pPr>
+          <w:r>
+            <w:t>Table of Contents</w:t>
+          </w:r>
+        </w:p>
+        <w:p>
+          <w:pPr>
+            <w:pStyle w:val="TOC1"/>
+            <w:tabs>
+              <w:tab w:val="right" w:leader="dot" w:pos="9350"/>
+            </w:tabs>
+            <w:rPr>
+              <w:noProof/>
+            </w:rPr>
+          </w:pPr>
+          <w:r>
+            <w:fldChar w:fldCharType="begin"/>
+          </w:r>
+          <w:r>
+            <w:instrText xml:space="preserve"> TOC \o "1-3" \h \z \u </w:instrText>
+          </w:r>
+          <w:r>
+            <w:fldChar w:fldCharType="separate"/>
+          </w:r>
+          <w:hyperlink w:anchor="_Toc237442433" w:history="1">
+            <w:r>
+              <w:rPr>
+                <w:rStyle w:val="Hyperlink"/>
+                <w:noProof/>
+              </w:rPr>
+              <w:t>Terraform (AzureRM) infrastructure</w:t>
+            </w:r>
+            <w:r>
+              <w:rPr>
+                <w:noProof/>
+                <w:webHidden/>
+              </w:rPr>
+              <w:tab/>
+            </w:r>
+            <w:r>
+              <w:rPr>
+                <w:noProof/>
+                <w:webHidden/>
+              </w:rPr>
+              <w:fldChar w:fldCharType="begin"/>
+            </w:r>
+            <w:r>
+              <w:rPr>
+                <w:noProof/>
+                <w:webHidden/>
+              </w:rPr>
+              <w:instrText xml:space="preserve"> PAGEREF _Toc237442433 \h </w:instrText>
+            </w:r>
+            <w:r>
+              <w:rPr>
+                <w:noProof/>
+                <w:webHidden/>
+              </w:rPr>
+            </w:r>
+            <w:r>
+              <w:rPr>
+                <w:noProof/>
+                <w:webHidden/>
+              </w:rPr>
+              <w:fldChar w:fldCharType="separate"/>
+            </w:r>
+            <w:r>
+              <w:rPr>
+                <w:noProof/>
+                <w:webHidden/>
+              </w:rPr>
+              <w:t>1</w:t>
+            </w:r>
+            <w:r>
+              <w:rPr>
+                <w:noProof/>
+                <w:webHidden/>
+              </w:rPr>
+              <w:fldChar w:fldCharType="end"/>
+            </w:r>
+          </w:hyperlink>
+        </w:p>
+        <w:p>
+          <w:pPr>
+            <w:pStyle w:val="TOC1"/>
+            <w:tabs>
+              <w:tab w:val="right" w:leader="dot" w:pos="9350"/>
+            </w:tabs>
+            <w:rPr>
+              <w:noProof/>
+            </w:rPr>
+          </w:pPr>
+          <w:hyperlink w:anchor="_Toc237442434" w:history="1">
+            <w:r>
+              <w:rPr>
+                <w:rStyle w:val="Hyperlink"/>
+                <w:noProof/>
+              </w:rPr>
+              <w:t>Azure Storage static website hosting</w:t>
+            </w:r>
+            <w:r>
+              <w:rPr>
+                <w:noProof/>
+                <w:webHidden/>
+              </w:rPr>
+              <w:tab/>
+            </w:r>
+            <w:r>
+              <w:rPr>
+                <w:noProof/>
+                <w:webHidden/>
+              </w:rPr>
+              <w:fldChar w:fldCharType="begin"/>
+            </w:r>
+            <w:r>
+              <w:rPr>
+                <w:noProof/>
+                <w:webHidden/>
+              </w:rPr>
+              <w:instrText xml:space="preserve"> PAGEREF _Toc237442434 \h </w:instrText>
+            </w:r>
+            <w:r>
+              <w:rPr>
+                <w:noProof/>
+                <w:webHidden/>
+              </w:rPr>
+            </w:r>
+            <w:r>
+              <w:rPr>
+                <w:noProof/>
+                <w:webHidden/>
+              </w:rPr>
+              <w:fldChar w:fldCharType="separate"/>
+            </w:r>
+            <w:r>
+              <w:rPr>
+                <w:noProof/>
+                <w:webHidden/>
+              </w:rPr>
+              <w:t>1</w:t>
+            </w:r>
+            <w:r>
+              <w:rPr>
+                <w:noProof/>
+                <w:webHidden/>
+              </w:rPr>
+              <w:fldChar w:fldCharType="end"/>
+            </w:r>
+          </w:hyperlink>
+        </w:p>
+        <w:p>
+          <w:pPr>
+            <w:pStyle w:val="TOC1"/>
+            <w:tabs>
+              <w:tab w:val="right" w:leader="dot" w:pos="9350"/>
+            </w:tabs>
+            <w:rPr>
+              <w:noProof/>
+            </w:rPr>
+          </w:pPr>
+          <w:hyperlink w:anchor="_Toc237442435" w:history="1">
+            <w:r>
+              <w:rPr>
+                <w:rStyle w:val="Hyperlink"/>
+                <w:noProof/>
+              </w:rPr>
+              <w:t>Static Website/UI</w:t>
+            </w:r>
+            <w:r>
+              <w:rPr>
+                <w:noProof/>
+                <w:webHidden/>
+              </w:rPr>
+              <w:tab/>
+            </w:r>
+            <w:r>
+              <w:rPr>
+                <w:noProof/>
+                <w:webHidden/>
+              </w:rPr>
+              <w:fldChar w:fldCharType="begin"/>
+            </w:r>
+            <w:r>
+              <w:rPr>
+                <w:noProof/>
+                <w:webHidden/>
+              </w:rPr>
+              <w:instrText xml:space="preserve"> PAGEREF _Toc237442435 \h </w:instrText>
+            </w:r>
+            <w:r>
+              <w:rPr>
+                <w:noProof/>
+                <w:webHidden/>
+              </w:rPr>
+            </w:r>
+            <w:r>
+              <w:rPr>
+                <w:noProof/>
+                <w:webHidden/>
+              </w:rPr>
+              <w:fldChar w:fldCharType="separate"/>
+            </w:r>
+            <w:r>
+              <w:rPr>
+                <w:noProof/>
+                <w:webHidden/>
+              </w:rPr>
+              <w:t>2</w:t>
+            </w:r>
+            <w:r>
+              <w:rPr>
+                <w:noProof/>
+                <w:webHidden/>
+              </w:rPr>
+              <w:fldChar w:fldCharType="end"/>
+            </w:r>
+          </w:hyperlink>
+        </w:p>
+        <w:p>
+          <w:pPr>
+            <w:pStyle w:val="TOC1"/>
+            <w:tabs>
+              <w:tab w:val="right" w:leader="dot" w:pos="9350"/>
+            </w:tabs>
+            <w:rPr>
+              <w:noProof/>
+            </w:rPr>
+          </w:pPr>
+          <w:hyperlink w:anchor="_Toc237442436" w:history="1">
+            <w:r>
+              <w:rPr>
+                <w:rStyle w:val="Hyperlink"/>
+                <w:noProof/>
+              </w:rPr>
+              <w:t>Visitor counter API</w:t>
+            </w:r>
+            <w:r>
+              <w:rPr>
+                <w:noProof/>
+                <w:webHidden/>
+              </w:rPr>
+              <w:tab/>
+            </w:r>
+            <w:r>
+              <w:rPr>
+                <w:noProof/>
+                <w:webHidden/>
+              </w:rPr>
+              <w:fldChar w:fldCharType="begin"/>
+            </w:r>
+            <w:r>
+              <w:rPr>
+                <w:noProof/>
+                <w:webHidden/>
+              </w:rPr>
+              <w:instrText xml:space="preserve"> PAGEREF _Toc237442436 \h </w:instrText>
+            </w:r>
+            <w:r>
+              <w:rPr>
+                <w:noProof/>
+                <w:webHidden/>
+              </w:rPr>
+            </w:r>
+            <w:r>
+              <w:rPr>
+                <w:noProof/>
+                <w:webHidden/>
+              </w:rPr>
+              <w:fldChar w:fldCharType="separate"/>
+            </w:r>
+            <w:r>
+              <w:rPr>
+                <w:noProof/>
+                <w:webHidden/>
+              </w:rPr>
+              <w:t>2</w:t>
+            </w:r>
+            <w:r>
+              <w:rPr>
+                <w:noProof/>
+                <w:webHidden/>
+              </w:rPr>
+              <w:fldChar w:fldCharType="end"/>
+            </w:r>
+          </w:hyperlink>
+        </w:p>
+        <w:p>
+          <w:pPr>
+            <w:pStyle w:val="TOC1"/>
+            <w:tabs>
+              <w:tab w:val="right" w:leader="dot" w:pos="9350"/>
+            </w:tabs>
+            <w:rPr>
+              <w:noProof/>
+            </w:rPr>
+          </w:pPr>
+          <w:hyperlink w:anchor="_Toc237442437" w:history="1">
+            <w:r>
+              <w:rPr>
+                <w:rStyle w:val="Hyperlink"/>
+                <w:noProof/>
+              </w:rPr>
+              <w:t>Table Storage counter backend</w:t>
+            </w:r>
+            <w:r>
+              <w:rPr>
+                <w:noProof/>
+                <w:webHidden/>
+              </w:rPr>
+              <w:tab/>
+            </w:r>
+            <w:r>
+              <w:rPr>
+                <w:noProof/>
+                <w:webHidden/>
+              </w:rPr>
+              <w:fldChar w:fldCharType="begin"/>
+            </w:r>
+            <w:r>
+              <w:rPr>
+                <w:noProof/>
+                <w:webHidden/>
+              </w:rPr>
+              <w:instrText xml:space="preserve"> PAGEREF _Toc237442437 \h </w:instrText>
+            </w:r>
+            <w:r>
+              <w:rPr>
+                <w:noProof/>
+                <w:webHidden/>
+              </w:rPr>
+            </w:r>
+            <w:r>
+              <w:rPr>
+                <w:noProof/>
+                <w:webHidden/>
+              </w:rPr>
+              <w:fldChar w:fldCharType="separate"/>
+            </w:r>
+            <w:r>
+              <w:rPr>
+                <w:noProof/>
+                <w:webHidden/>
+              </w:rPr>
+              <w:t>2</w:t>
+            </w:r>
+            <w:r>
+              <w:rPr>
+                <w:noProof/>
+                <w:webHidden/>
+              </w:rPr>
+              <w:fldChar w:fldCharType="end"/>
+            </w:r>
+          </w:hyperlink>
+        </w:p>
+        <w:p>
+          <w:pPr>
+            <w:pStyle w:val="TOC1"/>
+            <w:tabs>
+              <w:tab w:val="right" w:leader="dot" w:pos="9350"/>
+            </w:tabs>
+            <w:rPr>
+              <w:noProof/>
+            </w:rPr>
+          </w:pPr>
+          <w:hyperlink w:anchor="_Toc237442438" w:history="1">
+            <w:r>
+              <w:rPr>
+                <w:rStyle w:val="Hyperlink"/>
+                <w:noProof/>
+              </w:rPr>
+              <w:t>CORS configuration</w:t>
+            </w:r>
+            <w:r>
+              <w:rPr>
+                <w:noProof/>
+                <w:webHidden/>
+              </w:rPr>
+              <w:tab/>
+            </w:r>
+            <w:r>
+              <w:rPr>
+                <w:noProof/>
+                <w:webHidden/>
+              </w:rPr>
+              <w:fldChar w:fldCharType="begin"/>
+            </w:r>
+            <w:r>
+              <w:rPr>
+                <w:noProof/>
+                <w:webHidden/>
+              </w:rPr>
+              <w:instrText xml:space="preserve"> PAGEREF _Toc237442438 \h </w:instrText>
+            </w:r>
+            <w:r>
+              <w:rPr>
+                <w:noProof/>
+                <w:webHidden/>
+              </w:rPr>
+            </w:r>
+            <w:r>
+              <w:rPr>
+                <w:noProof/>
+                <w:webHidden/>
+              </w:rPr>
+              <w:fldChar w:fldCharType="separate"/>
+            </w:r>
+            <w:r>
+              <w:rPr>
+                <w:noProof/>
+                <w:webHidden/>
+              </w:rPr>
+              <w:t>2</w:t>
+            </w:r>
+            <w:r>
+              <w:rPr>
+                <w:noProof/>
+                <w:webHidden/>
+              </w:rPr>
+              <w:fldChar w:fldCharType="end"/>
+            </w:r>
+          </w:hyperlink>
+        </w:p>
+        <w:p>
+          <w:pPr>
+            <w:pStyle w:val="TOC1"/>
+            <w:tabs>
+              <w:tab w:val="right" w:leader="dot" w:pos="9350"/>
+            </w:tabs>
+            <w:rPr>
+              <w:noProof/>
+            </w:rPr>
+          </w:pPr>
+          <w:hyperlink w:anchor="_Toc237442439" w:history="1">
+            <w:r>
+              <w:rPr>
+                <w:rStyle w:val="Hyperlink"/>
+                <w:noProof/>
+              </w:rPr>
+              <w:t>Function deployment</w:t>
+            </w:r>
+            <w:r>
+              <w:rPr>
+                <w:noProof/>
+                <w:webHidden/>
+              </w:rPr>
+              <w:tab/>
+            </w:r>
+            <w:r>
+              <w:rPr>
+                <w:noProof/>
+                <w:webHidden/>
+              </w:rPr>
+              <w:fldChar w:fldCharType="begin"/>
+            </w:r>
+            <w:r>
+              <w:rPr>
+                <w:noProof/>
+                <w:webHidden/>
+              </w:rPr>
+              <w:instrText xml:space="preserve"> PAGEREF _Toc237442439 \h </w:instrText>
+            </w:r>
+            <w:r>
+              <w:rPr>
+                <w:noProof/>
+                <w:webHidden/>
+              </w:rPr>
+            </w:r>
+            <w:r>
+              <w:rPr>
+                <w:noProof/>
+                <w:webHidden/>
+              </w:rPr>
+              <w:fldChar w:fldCharType="separate"/>
+            </w:r>
+            <w:r>
+              <w:rPr>
+                <w:noProof/>
+                <w:webHidden/>
+              </w:rPr>
+              <w:t>2</w:t>
+            </w:r>
+            <w:r>
+              <w:rPr>
+                <w:noProof/>
+                <w:webHidden/>
+              </w:rPr>
+              <w:fldChar w:fldCharType="end"/>
+            </w:r>
+          </w:hyperlink>
+        </w:p>
+        <w:p>
+          <w:pPr>
+            <w:pStyle w:val="TOC1"/>
+            <w:tabs>
+              <w:tab w:val="right" w:leader="dot" w:pos="9350"/>
+            </w:tabs>
+            <w:rPr>
+              <w:noProof/>
+            </w:rPr>
+          </w:pPr>
+          <w:hyperlink w:anchor="_Toc237442440" w:history="1">
+            <w:r>
+              <w:rPr>
+                <w:rStyle w:val="Hyperlink"/>
+                <w:noProof/>
+              </w:rPr>
+              <w:t>Config-driven API URL</w:t>
+            </w:r>
+            <w:r>
+              <w:rPr>
+                <w:noProof/>
+                <w:webHidden/>
+              </w:rPr>
+              <w:tab/>
+            </w:r>
+            <w:r>
+              <w:rPr>
+                <w:noProof/>
+                <w:webHidden/>
+              </w:rPr>
+              <w:fldChar w:fldCharType="begin"/>
+            </w:r>
+            <w:r>
+              <w:rPr>
+                <w:noProof/>
+                <w:webHidden/>
+              </w:rPr>
+              <w:instrText xml:space="preserve"> PAGEREF _Toc237442440 \h </w:instrText>
+            </w:r>
+            <w:r>
+              <w:rPr>
+                <w:noProof/>
+                <w:webHidden/>
+              </w:rPr>
+            </w:r>
+            <w:r>
+              <w:rPr>
+                <w:noProof/>
+                <w:webHidden/>
+              </w:rPr>
+              <w:fldChar w:fldCharType="separate"/>
+            </w:r>
+            <w:r>
+              <w:rPr>
+                <w:noProof/>
+                <w:webHidden/>
+              </w:rPr>
+              <w:t>2</w:t>
+            </w:r>
+            <w:r>
+              <w:rPr>
+                <w:noProof/>
+                <w:webHidden/>
+              </w:rPr>
+              <w:fldChar w:fldCharType="end"/>
+            </w:r>
+          </w:hyperlink>
+        </w:p>
+        <w:p>
+          <w:pPr>
+            <w:pStyle w:val="TOC1"/>
+            <w:tabs>
+              <w:tab w:val="right" w:leader="dot" w:pos="9350"/>
+            </w:tabs>
+            <w:rPr>
+              <w:noProof/>
+            </w:rPr>
+          </w:pPr>
+          <w:hyperlink w:anchor="_Toc237442441" w:history="1">
+            <w:r>
+              <w:rPr>
+                <w:rStyle w:val="Hyperlink"/>
+                <w:noProof/>
+              </w:rPr>
+              <w:t>Azure subscription quota workaround</w:t>
+            </w:r>
+            <w:r>
+              <w:rPr>
+                <w:noProof/>
+                <w:webHidden/>
+              </w:rPr>
+              <w:tab/>
+            </w:r>
+            <w:r>
+              <w:rPr>
+                <w:noProof/>
+                <w:webHidden/>
+              </w:rPr>
+              <w:fldChar w:fldCharType="begin"/>
+            </w:r>
+            <w:r>
+              <w:rPr>
+                <w:noProof/>
+                <w:webHidden/>
+              </w:rPr>
+              <w:instrText xml:space="preserve"> PAGEREF _Toc237442441 \h </w:instrText>
+            </w:r>
+            <w:r>
+              <w:rPr>
+                <w:noProof/>
+                <w:webHidden/>
+              </w:rPr>
+            </w:r>
+            <w:r>
+              <w:rPr>
+                <w:noProof/>
+                <w:webHidden/>
+              </w:rPr>
+              <w:fldChar w:fldCharType="separate"/>
+            </w:r>
+            <w:r>
+              <w:rPr>
+                <w:noProof/>
+                <w:webHidden/>
+              </w:rPr>
+              <w:t>2</w:t>
+            </w:r>
+            <w:r>
+              <w:rPr>
+                <w:noProof/>
+                <w:webHidden/>
+              </w:rPr>
+              <w:fldChar w:fldCharType="end"/>
+            </w:r>
+          </w:hyperlink>
+        </w:p>
+        <w:p>
+          <w:pPr>
+            <w:pStyle w:val="TOC1"/>
+            <w:tabs>
+              <w:tab w:val="right" w:leader="dot" w:pos="9350"/>
+            </w:tabs>
+            <w:rPr>
+              <w:noProof/>
+            </w:rPr>
+          </w:pPr>
+          <w:hyperlink w:anchor="_Toc237442442" w:history="1">
+            <w:r>
+              <w:rPr>
+                <w:rStyle w:val="Hyperlink"/>
+                <w:noProof/>
+              </w:rPr>
+              <w:t>Cost discipline</w:t>
+            </w:r>
+            <w:r>
+              <w:rPr>
+                <w:noProof/>
+                <w:webHidden/>
+              </w:rPr>
+              <w:tab/>
+            </w:r>
+            <w:r>
+              <w:rPr>
+                <w:noProof/>
+                <w:webHidden/>
+              </w:rPr>
+              <w:fldChar w:fldCharType="begin"/>
+            </w:r>
+            <w:r>
+              <w:rPr>
+                <w:noProof/>
+                <w:webHidden/>
+              </w:rPr>
+              <w:instrText xml:space="preserve"> PAGEREF _Toc237442442 \h </w:instrText>
+            </w:r>
+            <w:r>
+              <w:rPr>
+                <w:noProof/>
+                <w:webHidden/>
+              </w:rPr>
+            </w:r>
+            <w:r>
+              <w:rPr>
+                <w:noProof/>
+                <w:webHidden/>
+              </w:rPr>
+              <w:fldChar w:fldCharType="separate"/>
+            </w:r>
+            <w:r>
+              <w:rPr>
+                <w:noProof/>
+                <w:webHidden/>
+              </w:rPr>
+              <w:t>2</w:t>
+            </w:r>
+            <w:r>
+              <w:rPr>
+                <w:noProof/>
+                <w:webHidden/>
+              </w:rPr>
+              <w:fldChar w:fldCharType="end"/>
+            </w:r>
+          </w:hyperlink>
+        </w:p>
+        <w:p>
+          <w:r>
+            <w:rPr>
+              <w:b/>
+              <w:bCs/>
+              <w:noProof/>
+            </w:rPr>
+            <w:fldChar w:fldCharType="end"/>
+          </w:r>
+        </w:p>
+      </w:sdtContent>
+    </w:sdt>
+    <w:p/>
     <w:p>
-      <w:r>
+      <w:pPr>
+        <w:pStyle w:val="Heading1"/>
+        <w:rPr>
+          <w:sz w:val="30"/>
+          <w:szCs w:val="30"/>
+        </w:rPr>
+      </w:pPr>
+      <w:bookmarkStart w:id="0" w:name="_Toc237442433"/>
+      <w:r>
+        <w:rPr>
+          <w:sz w:val="30"/>
+          <w:szCs w:val="30"/>
+        </w:rPr>
         <w:t>Te</w:t>
       </w:r>
       <w:r>
+        <w:rPr>
+          <w:sz w:val="30"/>
+          <w:szCs w:val="30"/>
+        </w:rPr>
         <w:t>rraform (</w:t>
       </w:r>
       <w:proofErr w:type="spellStart"/>
       <w:r>
+        <w:rPr>
+          <w:sz w:val="30"/>
+          <w:szCs w:val="30"/>
+        </w:rPr>
         <w:t>AzureRM</w:t>
       </w:r>
       <w:proofErr w:type="spellEnd"/>
       <w:r>
+        <w:rPr>
+          <w:sz w:val="30"/>
+          <w:szCs w:val="30"/>
+        </w:rPr>
         <w:t>)</w:t>
       </w:r>
       <w:r>
+        <w:rPr>
+          <w:sz w:val="30"/>
+          <w:szCs w:val="30"/>
+        </w:rPr>
         <w:t xml:space="preserve"> infrastructure</w:t>
       </w:r>
+      <w:bookmarkEnd w:id="0"/>
     </w:p>
     <w:p>
       <w:pPr>
@@ -81,9 +851,31 @@
       </w:r>
     </w:p>
     <w:p>
-      <w:r>
-        <w:t>Azure Storage static website hosting</w:t>
-      </w:r>
+      <w:pPr>
+        <w:pStyle w:val="Heading1"/>
+        <w:rPr>
+          <w:sz w:val="30"/>
+          <w:szCs w:val="30"/>
+        </w:rPr>
+      </w:pPr>
+      <w:bookmarkStart w:id="1" w:name="_Toc237442434"/>
+      <w:r>
+        <w:rPr>
+          <w:sz w:val="30"/>
+          <w:szCs w:val="30"/>
+        </w:rPr>
+        <w:t xml:space="preserve">Azure Storage </w:t>
+      </w:r>
+      <w:proofErr w:type="gramStart"/>
+      <w:r>
+        <w:rPr>
+          <w:sz w:val="30"/>
+          <w:szCs w:val="30"/>
+        </w:rPr>
+        <w:t>static website hosting</w:t>
+      </w:r>
+      <w:bookmarkEnd w:id="1"/>
+      <w:proofErr w:type="gramEnd"/>
     </w:p>
     <w:p>
       <w:pPr>
@@ -110,14 +902,41 @@
       </w:r>
     </w:p>
     <w:p>
-      <w:r>
+      <w:pPr>
+        <w:pStyle w:val="Heading1"/>
+        <w:rPr>
+          <w:sz w:val="30"/>
+          <w:szCs w:val="30"/>
+        </w:rPr>
+      </w:pPr>
+      <w:bookmarkStart w:id="2" w:name="_Toc237442435"/>
+      <w:r>
+        <w:rPr>
+          <w:sz w:val="30"/>
+          <w:szCs w:val="30"/>
+        </w:rPr>
+        <w:lastRenderedPageBreak/>
         <w:t>Static Website/UI</w:t>
       </w:r>
+      <w:bookmarkEnd w:id="2"/>
     </w:p>
     <w:p>
-      <w:r>
+      <w:pPr>
+        <w:pStyle w:val="Heading1"/>
+        <w:rPr>
+          <w:sz w:val="30"/>
+          <w:szCs w:val="30"/>
+        </w:rPr>
+      </w:pPr>
+      <w:bookmarkStart w:id="3" w:name="_Toc237442436"/>
+      <w:r>
+        <w:rPr>
+          <w:sz w:val="30"/>
+          <w:szCs w:val="30"/>
+        </w:rPr>
         <w:t>Visitor counter API</w:t>
       </w:r>
+      <w:bookmarkEnd w:id="3"/>
     </w:p>
     <w:p>
       <w:pPr>
@@ -144,9 +963,22 @@
       </w:r>
     </w:p>
     <w:p>
-      <w:r>
+      <w:pPr>
+        <w:pStyle w:val="Heading1"/>
+        <w:rPr>
+          <w:sz w:val="30"/>
+          <w:szCs w:val="30"/>
+        </w:rPr>
+      </w:pPr>
+      <w:bookmarkStart w:id="4" w:name="_Toc237442437"/>
+      <w:r>
+        <w:rPr>
+          <w:sz w:val="30"/>
+          <w:szCs w:val="30"/>
+        </w:rPr>
         <w:t>Table Storage counter backend</w:t>
       </w:r>
+      <w:bookmarkEnd w:id="4"/>
     </w:p>
     <w:p>
       <w:pPr>
@@ -161,9 +993,22 @@
       </w:r>
     </w:p>
     <w:p>
-      <w:r>
+      <w:pPr>
+        <w:pStyle w:val="Heading1"/>
+        <w:rPr>
+          <w:sz w:val="30"/>
+          <w:szCs w:val="30"/>
+        </w:rPr>
+      </w:pPr>
+      <w:bookmarkStart w:id="5" w:name="_Toc237442438"/>
+      <w:r>
+        <w:rPr>
+          <w:sz w:val="30"/>
+          <w:szCs w:val="30"/>
+        </w:rPr>
         <w:t>CORS configuration</w:t>
       </w:r>
+      <w:bookmarkEnd w:id="5"/>
     </w:p>
     <w:p>
       <w:pPr>
@@ -178,9 +1023,22 @@
       </w:r>
     </w:p>
     <w:p>
-      <w:r>
+      <w:pPr>
+        <w:pStyle w:val="Heading1"/>
+        <w:rPr>
+          <w:sz w:val="30"/>
+          <w:szCs w:val="30"/>
+        </w:rPr>
+      </w:pPr>
+      <w:bookmarkStart w:id="6" w:name="_Toc237442439"/>
+      <w:r>
+        <w:rPr>
+          <w:sz w:val="30"/>
+          <w:szCs w:val="30"/>
+        </w:rPr>
         <w:t>Function deployment</w:t>
       </w:r>
+      <w:bookmarkEnd w:id="6"/>
     </w:p>
     <w:p>
       <w:pPr>
@@ -219,9 +1077,22 @@
       </w:r>
     </w:p>
     <w:p>
-      <w:r>
+      <w:pPr>
+        <w:pStyle w:val="Heading1"/>
+        <w:rPr>
+          <w:sz w:val="30"/>
+          <w:szCs w:val="30"/>
+        </w:rPr>
+      </w:pPr>
+      <w:bookmarkStart w:id="7" w:name="_Toc237442440"/>
+      <w:r>
+        <w:rPr>
+          <w:sz w:val="30"/>
+          <w:szCs w:val="30"/>
+        </w:rPr>
         <w:t>Config-driven API URL</w:t>
       </w:r>
+      <w:bookmarkEnd w:id="7"/>
     </w:p>
     <w:p>
       <w:pPr>
@@ -236,9 +1107,22 @@
       </w:r>
     </w:p>
     <w:p>
-      <w:r>
+      <w:pPr>
+        <w:pStyle w:val="Heading1"/>
+        <w:rPr>
+          <w:sz w:val="30"/>
+          <w:szCs w:val="30"/>
+        </w:rPr>
+      </w:pPr>
+      <w:bookmarkStart w:id="8" w:name="_Toc237442441"/>
+      <w:r>
+        <w:rPr>
+          <w:sz w:val="30"/>
+          <w:szCs w:val="30"/>
+        </w:rPr>
         <w:t>Azure subscription quota workaround</w:t>
       </w:r>
+      <w:bookmarkEnd w:id="8"/>
     </w:p>
     <w:p>
       <w:pPr>
@@ -249,7 +1133,6 @@
         </w:numPr>
       </w:pPr>
       <w:r>
-        <w:lastRenderedPageBreak/>
         <w:t xml:space="preserve">Added an </w:t>
       </w:r>
       <w:proofErr w:type="spellStart"/>
@@ -262,9 +1145,22 @@
       </w:r>
     </w:p>
     <w:p>
-      <w:r>
+      <w:pPr>
+        <w:pStyle w:val="Heading1"/>
+        <w:rPr>
+          <w:sz w:val="30"/>
+          <w:szCs w:val="30"/>
+        </w:rPr>
+      </w:pPr>
+      <w:bookmarkStart w:id="9" w:name="_Toc237442442"/>
+      <w:r>
+        <w:rPr>
+          <w:sz w:val="30"/>
+          <w:szCs w:val="30"/>
+        </w:rPr>
         <w:t>Cost discipline</w:t>
       </w:r>
+      <w:bookmarkEnd w:id="9"/>
     </w:p>
     <w:p>
       <w:pPr>
@@ -278,11 +1174,20 @@
         <w:t>Able to destroy infrastructure</w:t>
       </w:r>
       <w:r>
-        <w:t xml:space="preserve"> when not demoing. </w:t>
+        <w:t xml:space="preserve"> when not </w:t>
+      </w:r>
+      <w:proofErr w:type="gramStart"/>
+      <w:r>
+        <w:t>demoing</w:t>
+      </w:r>
+      <w:proofErr w:type="gramEnd"/>
+      <w:r>
+        <w:t xml:space="preserve">. </w:t>
       </w:r>
     </w:p>
     <w:p/>
     <w:sectPr>
+      <w:headerReference w:type="default" r:id="rId9"/>
       <w:pgSz w:w="12240" w:h="15840"/>
       <w:pgMar w:top="1440" w:right="1440" w:bottom="1440" w:left="1440" w:header="720" w:footer="720" w:gutter="0"/>
       <w:cols w:space="720"/>
@@ -290,6 +1195,109 @@
     </w:sectPr>
   </w:body>
 </w:document>
+</file>
+
+<file path=word/endnotes.xml><?xml version="1.0" encoding="utf-8"?>
+<w:endnotes xmlns:wpc="http://schemas.microsoft.com/office/word/2010/wordprocessingCanvas" xmlns:cx="http://schemas.microsoft.com/office/drawing/2014/chartex" xmlns:cx1="http://schemas.microsoft.com/office/drawing/2015/9/8/chartex" xmlns:cx2="http://schemas.microsoft.com/office/drawing/2015/10/21/chartex" xmlns:cx3="http://schemas.microsoft.com/office/drawing/2016/5/9/chartex" xmlns:cx4="http://schemas.microsoft.com/office/drawing/2016/5/10/chartex" xmlns:cx5="http://schemas.microsoft.com/office/drawing/2016/5/11/chartex" xmlns:cx6="http://schemas.microsoft.com/office/drawing/2016/5/12/chartex" xmlns:cx7="http://schemas.microsoft.com/office/drawing/2016/5/13/chartex" xmlns:cx8="http://schemas.microsoft.com/office/drawing/2016/5/14/chartex" xmlns:mc="http://schemas.openxmlformats.org/markup-compatibility/2006" xmlns:aink="http://schemas.microsoft.com/office/drawing/2016/ink" xmlns:am3d="http://schemas.microsoft.com/office/drawing/2017/model3d" xmlns:o="urn:schemas-microsoft-com:office:office" xmlns:oel="http://schemas.microsoft.com/office/2019/extlst" xmlns:r="http://schemas.openxmlformats.org/officeDocument/2006/relationships" xmlns:m="http://schemas.openxmlformats.org/officeDocument/2006/math" xmlns:v="urn:schemas-microsoft-com:vml" xmlns:wp14="http://schemas.microsoft.com/office/word/2010/wordprocessingDrawing" xmlns:wp="http://schemas.openxmlformats.org/drawingml/2006/wordprocessingDrawing" xmlns:w10="urn:schemas-microsoft-com:office:word" xmlns:w="http://schemas.openxmlformats.org/wordprocessingml/2006/main" xmlns:w14="http://schemas.microsoft.com/office/word/2010/wordml" xmlns:w15="http://schemas.microsoft.com/office/word/2012/wordml" xmlns:w16cei="http://schemas.microsoft.com/office/word/2026/wordml/cei" xmlns:w16cex="http://schemas.microsoft.com/office/word/2018/wordml/cex" xmlns:w16cid="http://schemas.microsoft.com/office/word/2016/wordml/cid" xmlns:w16="http://schemas.microsoft.com/office/word/2018/wordml" xmlns:w16du="http://schemas.microsoft.com/office/word/2023/wordml/word16du" xmlns:w16sdtdh="http://schemas.microsoft.com/office/word/2020/wordml/sdtdatahash" xmlns:w16sdtfl="http://schemas.microsoft.com/office/word/2024/wordml/sdtformatlock" xmlns:w16se="http://schemas.microsoft.com/office/word/2015/wordml/symex" xmlns:wpg="http://schemas.microsoft.com/office/word/2010/wordprocessingGroup" xmlns:wpi="http://schemas.microsoft.com/office/word/2010/wordprocessingInk" xmlns:wne="http://schemas.microsoft.com/office/word/2006/wordml" xmlns:wps="http://schemas.microsoft.com/office/word/2010/wordprocessingShape" mc:Ignorable="w14 w15 w16se w16cid w16 w16cex w16sdtdh w16sdtfl w16du wp14">
+  <w:endnote w:type="separator" w:id="-1">
+    <w:p>
+      <w:pPr>
+        <w:spacing w:after="0" w:line="240" w:lineRule="auto"/>
+      </w:pPr>
+      <w:r>
+        <w:separator/>
+      </w:r>
+    </w:p>
+  </w:endnote>
+  <w:endnote w:type="continuationSeparator" w:id="0">
+    <w:p>
+      <w:pPr>
+        <w:spacing w:after="0" w:line="240" w:lineRule="auto"/>
+      </w:pPr>
+      <w:r>
+        <w:continuationSeparator/>
+      </w:r>
+    </w:p>
+  </w:endnote>
+</w:endnotes>
+</file>
+
+<file path=word/footnotes.xml><?xml version="1.0" encoding="utf-8"?>
+<w:footnotes xmlns:wpc="http://schemas.microsoft.com/office/word/2010/wordprocessingCanvas" xmlns:cx="http://schemas.microsoft.com/office/drawing/2014/chartex" xmlns:cx1="http://schemas.microsoft.com/office/drawing/2015/9/8/chartex" xmlns:cx2="http://schemas.microsoft.com/office/drawing/2015/10/21/chartex" xmlns:cx3="http://schemas.microsoft.com/office/drawing/2016/5/9/chartex" xmlns:cx4="http://schemas.microsoft.com/office/drawing/2016/5/10/chartex" xmlns:cx5="http://schemas.microsoft.com/office/drawing/2016/5/11/chartex" xmlns:cx6="http://schemas.microsoft.com/office/drawing/2016/5/12/chartex" xmlns:cx7="http://schemas.microsoft.com/office/drawing/2016/5/13/chartex" xmlns:cx8="http://schemas.microsoft.com/office/drawing/2016/5/14/chartex" xmlns:mc="http://schemas.openxmlformats.org/markup-compatibility/2006" xmlns:aink="http://schemas.microsoft.com/office/drawing/2016/ink" xmlns:am3d="http://schemas.microsoft.com/office/drawing/2017/model3d" xmlns:o="urn:schemas-microsoft-com:office:office" xmlns:oel="http://schemas.microsoft.com/office/2019/extlst" xmlns:r="http://schemas.openxmlformats.org/officeDocument/2006/relationships" xmlns:m="http://schemas.openxmlformats.org/officeDocument/2006/math" xmlns:v="urn:schemas-microsoft-com:vml" xmlns:wp14="http://schemas.microsoft.com/office/word/2010/wordprocessingDrawing" xmlns:wp="http://schemas.openxmlformats.org/drawingml/2006/wordprocessingDrawing" xmlns:w10="urn:schemas-microsoft-com:office:word" xmlns:w="http://schemas.openxmlformats.org/wordprocessingml/2006/main" xmlns:w14="http://schemas.microsoft.com/office/word/2010/wordml" xmlns:w15="http://schemas.microsoft.com/office/word/2012/wordml" xmlns:w16cei="http://schemas.microsoft.com/office/word/2026/wordml/cei" xmlns:w16cex="http://schemas.microsoft.com/office/word/2018/wordml/cex" xmlns:w16cid="http://schemas.microsoft.com/office/word/2016/wordml/cid" xmlns:w16="http://schemas.microsoft.com/office/word/2018/wordml" xmlns:w16du="http://schemas.microsoft.com/office/word/2023/wordml/word16du" xmlns:w16sdtdh="http://schemas.microsoft.com/office/word/2020/wordml/sdtdatahash" xmlns:w16sdtfl="http://schemas.microsoft.com/office/word/2024/wordml/sdtformatlock" xmlns:w16se="http://schemas.microsoft.com/office/word/2015/wordml/symex" xmlns:wpg="http://schemas.microsoft.com/office/word/2010/wordprocessingGroup" xmlns:wpi="http://schemas.microsoft.com/office/word/2010/wordprocessingInk" xmlns:wne="http://schemas.microsoft.com/office/word/2006/wordml" xmlns:wps="http://schemas.microsoft.com/office/word/2010/wordprocessingShape" mc:Ignorable="w14 w15 w16se w16cid w16 w16cex w16sdtdh w16sdtfl w16du wp14">
+  <w:footnote w:type="separator" w:id="-1">
+    <w:p>
+      <w:pPr>
+        <w:spacing w:after="0" w:line="240" w:lineRule="auto"/>
+      </w:pPr>
+      <w:r>
+        <w:separator/>
+      </w:r>
+    </w:p>
+  </w:footnote>
+  <w:footnote w:type="continuationSeparator" w:id="0">
+    <w:p>
+      <w:pPr>
+        <w:spacing w:after="0" w:line="240" w:lineRule="auto"/>
+      </w:pPr>
+      <w:r>
+        <w:continuationSeparator/>
+      </w:r>
+    </w:p>
+  </w:footnote>
+</w:footnotes>
+</file>
+
+<file path=word/header1.xml><?xml version="1.0" encoding="utf-8"?>
+<w:hdr xmlns:wpc="http://schemas.microsoft.com/office/word/2010/wordprocessingCanvas" xmlns:cx="http://schemas.microsoft.com/office/drawing/2014/chartex" xmlns:cx1="http://schemas.microsoft.com/office/drawing/2015/9/8/chartex" xmlns:cx2="http://schemas.microsoft.com/office/drawing/2015/10/21/chartex" xmlns:cx3="http://schemas.microsoft.com/office/drawing/2016/5/9/chartex" xmlns:cx4="http://schemas.microsoft.com/office/drawing/2016/5/10/chartex" xmlns:cx5="http://schemas.microsoft.com/office/drawing/2016/5/11/chartex" xmlns:cx6="http://schemas.microsoft.com/office/drawing/2016/5/12/chartex" xmlns:cx7="http://schemas.microsoft.com/office/drawing/2016/5/13/chartex" xmlns:cx8="http://schemas.microsoft.com/office/drawing/2016/5/14/chartex" xmlns:mc="http://schemas.openxmlformats.org/markup-compatibility/2006" xmlns:aink="http://schemas.microsoft.com/office/drawing/2016/ink" xmlns:am3d="http://schemas.microsoft.com/office/drawing/2017/model3d" xmlns:o="urn:schemas-microsoft-com:office:office" xmlns:oel="http://schemas.microsoft.com/office/2019/extlst" xmlns:r="http://schemas.openxmlformats.org/officeDocument/2006/relationships" xmlns:m="http://schemas.openxmlformats.org/officeDocument/2006/math" xmlns:v="urn:schemas-microsoft-com:vml" xmlns:wp14="http://schemas.microsoft.com/office/word/2010/wordprocessingDrawing" xmlns:wp="http://schemas.openxmlformats.org/drawingml/2006/wordprocessingDrawing" xmlns:w10="urn:schemas-microsoft-com:office:word" xmlns:w="http://schemas.openxmlformats.org/wordprocessingml/2006/main" xmlns:w14="http://schemas.microsoft.com/office/word/2010/wordml" xmlns:w15="http://schemas.microsoft.com/office/word/2012/wordml" xmlns:w16cei="http://schemas.microsoft.com/office/word/2026/wordml/cei" xmlns:w16cex="http://schemas.microsoft.com/office/word/2018/wordml/cex" xmlns:w16cid="http://schemas.microsoft.com/office/word/2016/wordml/cid" xmlns:w16="http://schemas.microsoft.com/office/word/2018/wordml" xmlns:w16du="http://schemas.microsoft.com/office/word/2023/wordml/word16du" xmlns:w16sdtdh="http://schemas.microsoft.com/office/word/2020/wordml/sdtdatahash" xmlns:w16sdtfl="http://schemas.microsoft.com/office/word/2024/wordml/sdtformatlock" xmlns:w16se="http://schemas.microsoft.com/office/word/2015/wordml/symex" xmlns:wpg="http://schemas.microsoft.com/office/word/2010/wordprocessingGroup" xmlns:wpi="http://schemas.microsoft.com/office/word/2010/wordprocessingInk" xmlns:wne="http://schemas.microsoft.com/office/word/2006/wordml" xmlns:wps="http://schemas.microsoft.com/office/word/2010/wordprocessingShape" mc:Ignorable="w14 w15 w16se w16cid w16 w16cex w16sdtdh w16sdtfl w16du wp14">
+  <w:sdt>
+    <w:sdtPr>
+      <w:id w:val="1017887394"/>
+      <w:docPartObj>
+        <w:docPartGallery w:val="Page Numbers (Top of Page)"/>
+        <w:docPartUnique/>
+      </w:docPartObj>
+    </w:sdtPr>
+    <w:sdtEndPr>
+      <w:rPr>
+        <w:noProof/>
+      </w:rPr>
+    </w:sdtEndPr>
+    <w:sdtContent>
+      <w:p>
+        <w:pPr>
+          <w:pStyle w:val="Header"/>
+          <w:jc w:val="right"/>
+        </w:pPr>
+        <w:r>
+          <w:fldChar w:fldCharType="begin"/>
+        </w:r>
+        <w:r>
+          <w:instrText xml:space="preserve"> PAGE   \* MERGEFORMAT </w:instrText>
+        </w:r>
+        <w:r>
+          <w:fldChar w:fldCharType="separate"/>
+        </w:r>
+        <w:r>
+          <w:rPr>
+            <w:noProof/>
+          </w:rPr>
+          <w:t>2</w:t>
+        </w:r>
+        <w:r>
+          <w:rPr>
+            <w:noProof/>
+          </w:rPr>
+          <w:fldChar w:fldCharType="end"/>
+        </w:r>
+      </w:p>
+    </w:sdtContent>
+  </w:sdt>
+  <w:p>
+    <w:pPr>
+      <w:pStyle w:val="Header"/>
+    </w:pPr>
+  </w:p>
+</w:hdr>
 </file>
 
 <file path=word/numbering.xml><?xml version="1.0" encoding="utf-8"?>
@@ -1700,6 +2708,81 @@
       <w:shd w:val="clear" w:color="auto" w:fill="E1DFDD"/>
     </w:rPr>
   </w:style>
+  <w:style w:type="paragraph" w:styleId="TOCHeading">
+    <w:name w:val="TOC Heading"/>
+    <w:basedOn w:val="Heading1"/>
+    <w:next w:val="Normal"/>
+    <w:uiPriority w:val="39"/>
+    <w:unhideWhenUsed/>
+    <w:qFormat/>
+    <w:rsid w:val="008F2126"/>
+    <w:pPr>
+      <w:spacing w:before="240" w:after="0" w:line="259" w:lineRule="auto"/>
+      <w:outlineLvl w:val="9"/>
+    </w:pPr>
+    <w:rPr>
+      <w:kern w:val="0"/>
+      <w:sz w:val="32"/>
+      <w:szCs w:val="32"/>
+      <w14:ligatures w14:val="none"/>
+    </w:rPr>
+  </w:style>
+  <w:style w:type="paragraph" w:styleId="TOC1">
+    <w:name w:val="toc 1"/>
+    <w:basedOn w:val="Normal"/>
+    <w:next w:val="Normal"/>
+    <w:autoRedefine/>
+    <w:uiPriority w:val="39"/>
+    <w:unhideWhenUsed/>
+    <w:rsid w:val="008F2126"/>
+    <w:pPr>
+      <w:spacing w:after="100"/>
+    </w:pPr>
+  </w:style>
+  <w:style w:type="paragraph" w:styleId="Header">
+    <w:name w:val="header"/>
+    <w:basedOn w:val="Normal"/>
+    <w:link w:val="HeaderChar"/>
+    <w:uiPriority w:val="99"/>
+    <w:unhideWhenUsed/>
+    <w:rsid w:val="00ED2B87"/>
+    <w:pPr>
+      <w:tabs>
+        <w:tab w:val="center" w:pos="4680"/>
+        <w:tab w:val="right" w:pos="9360"/>
+      </w:tabs>
+      <w:spacing w:after="0" w:line="240" w:lineRule="auto"/>
+    </w:pPr>
+  </w:style>
+  <w:style w:type="character" w:customStyle="1" w:styleId="HeaderChar">
+    <w:name w:val="Header Char"/>
+    <w:basedOn w:val="DefaultParagraphFont"/>
+    <w:link w:val="Header"/>
+    <w:uiPriority w:val="99"/>
+    <w:rsid w:val="00ED2B87"/>
+  </w:style>
+  <w:style w:type="paragraph" w:styleId="Footer">
+    <w:name w:val="footer"/>
+    <w:basedOn w:val="Normal"/>
+    <w:link w:val="FooterChar"/>
+    <w:uiPriority w:val="99"/>
+    <w:unhideWhenUsed/>
+    <w:rsid w:val="00ED2B87"/>
+    <w:pPr>
+      <w:tabs>
+        <w:tab w:val="center" w:pos="4680"/>
+        <w:tab w:val="right" w:pos="9360"/>
+      </w:tabs>
+      <w:spacing w:after="0" w:line="240" w:lineRule="auto"/>
+    </w:pPr>
+  </w:style>
+  <w:style w:type="character" w:customStyle="1" w:styleId="FooterChar">
+    <w:name w:val="Footer Char"/>
+    <w:basedOn w:val="DefaultParagraphFont"/>
+    <w:link w:val="Footer"/>
+    <w:uiPriority w:val="99"/>
+    <w:rsid w:val="00ED2B87"/>
+  </w:style>
 </w:styles>
 </file>
 
@@ -1996,4 +3079,16 @@
     </a:ext>
   </a:extLst>
 </a:theme>
+</file>
+
+<file path=customXml/item1.xml><?xml version="1.0" encoding="utf-8"?>
+<b:Sources xmlns:b="http://schemas.openxmlformats.org/officeDocument/2006/bibliography" xmlns="http://schemas.openxmlformats.org/officeDocument/2006/bibliography" SelectedStyle="\APASixthEditionOfficeOnline.xsl" StyleName="APA" Version="6"/>
+</file>
+
+<file path=customXml/itemProps1.xml><?xml version="1.0" encoding="utf-8"?>
+<ds:datastoreItem xmlns:ds="http://schemas.openxmlformats.org/officeDocument/2006/customXml" ds:itemID="{6AABE8CF-BBC6-4306-9C84-50CEFEB17A5C}">
+  <ds:schemaRefs>
+    <ds:schemaRef ds:uri="http://schemas.openxmlformats.org/officeDocument/2006/bibliography"/>
+  </ds:schemaRefs>
+</ds:datastoreItem>
 </file>
</xml_diff>